<commit_message>
Statuten: Beiträge insgesamt nicht kostendeckend, Erwerbstätigkeit als Begriff des KS 12
Art. 3 Abs. 4: Beiträge nach Leistungsfähigkeit abgestuft und insgesamt nicht
kostendeckend; die Marktpreis-Klausel entfällt. Damit sind teilweise
kostendeckende Lernbus-Lektionen möglich, ohne das Opfer-Erfordernis der
Steuerbefreiung (BGer 9C_234/2024, BGE 146 II 359 E. 6.1) zu verletzen.
Art. 4 Abs. 2: «Erwerbstätigkeit» statt «wirtschaftliche Tätigkeit», damit der
entgeltliche Zweckbetrieb nicht als untergeordnete Nebentätigkeit gelesen wird.

Co-Authored-By: Claude Fable 5.1 <noreply@anthropic.com>
Claude-Session: https://claude.ai/code/session_01QU2zAy6ApGeV8UXt2ocQV3
</commit_message>
<xml_diff>
--- a/verein/Statuten_Verein_Lerngesellschaft.docx
+++ b/verein/Statuten_Verein_Lerngesellschaft.docx
@@ -338,7 +338,7 @@
         <w:t xml:space="preserve">4</w:t>
       </w:r>
       <w:r>
-        <w:t xml:space="preserve">	Soweit der Verein für seine Angebote Beiträge erhebt, sind diese nicht kostendeckend, liegen unter den Marktpreisen und sind nach der wirtschaftlichen Leistungsfähigkeit abgestuft. Ermässigungen und Freiplätze stellen sicher, dass kein Kind aus finanziellen Gründen ausgeschlossen wird.</w:t>
+        <w:t xml:space="preserve">	Soweit der Verein für seine Angebote Beiträge erhebt, sind diese nach der wirtschaftlichen Leistungsfähigkeit abgestuft und decken die Kosten der Angebote insgesamt nicht. Ermässigungen und Freiplätze stellen sicher, dass kein Kind aus finanziellen Gründen ausgeschlossen wird.</w:t>
       </w:r>
     </w:p>
     <w:p>
@@ -392,7 +392,7 @@
         <w:t xml:space="preserve">2</w:t>
       </w:r>
       <w:r>
-        <w:t xml:space="preserve">	Sämtliche Mittel sind ausschliesslich und unwiderruflich dem Vereinszweck gewidmet. Eine wirtschaftliche Tätigkeit ist nur als untergeordnetes Hilfsmittel zur Verwirklichung des Zwecks zulässig; Überschüsse werden vollumfänglich dem Vereinszweck zugeführt.</w:t>
+        <w:t xml:space="preserve">	Sämtliche Mittel sind ausschliesslich und unwiderruflich dem Vereinszweck gewidmet. Eine Erwerbstätigkeit ist nur als untergeordnetes Mittel zur Verwirklichung des Zwecks zulässig; Überschüsse werden vollumfänglich dem Vereinszweck zugeführt.</w:t>
       </w:r>
     </w:p>
     <w:p>

</xml_diff>

<commit_message>
Statuten: Wortlaut nach Merkblatt Steuerbefreiung BS vom 4. Juni 2025
Art. 13 Abs. 2: Vermögen fällt an eine wegen gemeinnütziger oder öffentlicher
Zwecke steuerbefreite juristische Person (Merkblatt Rz 6).
Art. 11 Abs. 2 und 4: Entschädigungen und Löhne massvoll und im Hinblick auf
die gemeinnützige Tätigkeit angemessen (Merkblatt Rz 10).

Co-Authored-By: Claude Fable 5.1 <noreply@anthropic.com>
Claude-Session: https://claude.ai/code/session_01QU2zAy6ApGeV8UXt2ocQV3
</commit_message>
<xml_diff>
--- a/verein/Statuten_Verein_Lerngesellschaft.docx
+++ b/verein/Statuten_Verein_Lerngesellschaft.docx
@@ -1171,7 +1171,7 @@
         <w:t xml:space="preserve">2</w:t>
       </w:r>
       <w:r>
-        <w:t xml:space="preserve">	Übernimmt ein Vorstandsmitglied ausnahmsweise operative Aufgaben, die über die Vorstandstätigkeit hinausgehen, kann dafür eine angemessene, marktübliche Entschädigung ausgerichtet werden. Der Vorstand beschliesst darüber unter Ausstand der betroffenen Person; der Beschluss bedarf der Genehmigung durch die Mitgliederversammlung.</w:t>
+        <w:t xml:space="preserve">	Übernimmt ein Vorstandsmitglied ausnahmsweise operative Aufgaben, die über die Vorstandstätigkeit hinausgehen, kann dafür eine Entschädigung ausgerichtet werden. Der Vorstand beschliesst darüber unter Ausstand der betroffenen Person; der Beschluss bedarf der Genehmigung durch die Mitgliederversammlung.</w:t>
       </w:r>
     </w:p>
     <w:p>
@@ -1211,7 +1211,7 @@
         <w:t xml:space="preserve">4</w:t>
       </w:r>
       <w:r>
-        <w:t xml:space="preserve">	Entschädigungen nach Absatz 2 und Rechtsgeschäfte nach Absatz 3 werden in der Jahresrechnung offengelegt.</w:t>
+        <w:t xml:space="preserve">	Entschädigungen und Löhne sind massvoll und im Hinblick auf die gemeinnützige Tätigkeit angemessen. Entschädigungen nach Absatz 2 und Rechtsgeschäfte nach Absatz 3 werden in der Jahresrechnung offengelegt.</w:t>
       </w:r>
     </w:p>
     <w:p>
@@ -1334,7 +1334,7 @@
         <w:t xml:space="preserve">2</w:t>
       </w:r>
       <w:r>
-        <w:t xml:space="preserve">	Das nach Tilgung der Schulden verbleibende Vermögen fällt an eine steuerbefreite juristische Person mit Sitz in der Schweiz, die einen gleichen oder ähnlichen Zweck verfolgt. Eine Verteilung unter die Mitglieder und ein Rückfall an die Gründerinnen und Gründer oder ihnen nahestehende Personen sind ausgeschlossen.</w:t>
+        <w:t xml:space="preserve">	Das nach Tilgung der Schulden verbleibende Vermögen fällt an eine wegen gemeinnütziger oder öffentlicher Zwecke steuerbefreite juristische Person mit Sitz in der Schweiz, die einen gleichen oder ähnlichen Zweck verfolgt. Eine Verteilung unter die Mitglieder und ein Rückfall an die Gründerinnen und Gründer oder ihnen nahestehende Personen sind ausgeschlossen.</w:t>
       </w:r>
     </w:p>
     <w:p>

</xml_diff>